<commit_message>
Recolor Team page to the logo palette: bordeaux, ochre, black
Co-Authored-By: Claude Opus 5.5 <noreply@anthropic.com>
Claude-Session: https://claude.ai/code/session_01KNCHjSiF6uUnNEUPxpBrDj
</commit_message>
<xml_diff>
--- a/tilda/TEAM_PAGE_GUIDE.docx
+++ b/tilda/TEAM_PAGE_GUIDE.docx
@@ -263,7 +263,7 @@
         <w:spacing w:after="160" w:before="360"/>
       </w:pPr>
       <w:r>
-        <w:t xml:space="preserve">4. Подставьте цвета бренда</w:t>
+        <w:t xml:space="preserve">4. Цвета бренда</w:t>
       </w:r>
     </w:p>
     <w:p>
@@ -271,7 +271,7 @@
         <w:spacing w:after="120"/>
       </w:pPr>
       <w:r>
-        <w:t xml:space="preserve">Все цвета собраны в самом начале кода, в разделе «ЦВЕТА БРЕНДА — меняйте только здесь». Сейчас стоят тёмные «сырные» тона с золотым акцентом. Замените значения после двоеточия на коды цветов со страницы анонса Cheese Expo 2027 — остальная страница перекрасится сама.</w:t>
+        <w:t xml:space="preserve">Страница окрашена в цвета логотипа Cheese Expo: чёрный, бордо и охра. Коды сняты с файла логотипа. Все цвета собраны в начале кода, в разделе «ЦВЕТА БРЕНДА — меняйте только здесь» — если понадобится поправить оттенок, достаточно заменить код после двоеточия, остальная страница перекрасится сама.</w:t>
       </w:r>
     </w:p>
     <w:tbl>
@@ -380,7 +380,7 @@
                 <w:b w:val="false"/>
                 <w:bCs w:val="false"/>
               </w:rPr>
-              <w:t xml:space="preserve">--ce-bg</w:t>
+              <w:t xml:space="preserve">--ce-black</w:t>
             </w:r>
           </w:p>
         </w:tc>
@@ -401,7 +401,7 @@
                 <w:b w:val="false"/>
                 <w:bCs w:val="false"/>
               </w:rPr>
-              <w:t xml:space="preserve">#15120e</w:t>
+              <w:t xml:space="preserve">#0b0b0b</w:t>
             </w:r>
           </w:p>
         </w:tc>
@@ -422,7 +422,7 @@
                 <w:b w:val="false"/>
                 <w:bCs w:val="false"/>
               </w:rPr>
-              <w:t xml:space="preserve">Основной фон страницы</w:t>
+              <w:t xml:space="preserve">Чёрный из логотипа: основной фон</w:t>
             </w:r>
           </w:p>
         </w:tc>
@@ -445,7 +445,7 @@
                 <w:b w:val="false"/>
                 <w:bCs w:val="false"/>
               </w:rPr>
-              <w:t xml:space="preserve">--ce-bg-alt</w:t>
+              <w:t xml:space="preserve">--ce-bordeaux</w:t>
             </w:r>
           </w:p>
         </w:tc>
@@ -466,7 +466,7 @@
                 <w:b w:val="false"/>
                 <w:bCs w:val="false"/>
               </w:rPr>
-              <w:t xml:space="preserve">#1d1913</w:t>
+              <w:t xml:space="preserve">#7d0e25</w:t>
             </w:r>
           </w:p>
         </w:tc>
@@ -487,7 +487,7 @@
                 <w:b w:val="false"/>
                 <w:bCs w:val="false"/>
               </w:rPr>
-              <w:t xml:space="preserve">Фон 2-й и 4-й секции (чередование)</w:t>
+              <w:t xml:space="preserve">Бордо из логотипа: фон 2-й и 4-й секции, заглушки фото</w:t>
             </w:r>
           </w:p>
         </w:tc>
@@ -510,7 +510,7 @@
                 <w:b w:val="false"/>
                 <w:bCs w:val="false"/>
               </w:rPr>
-              <w:t xml:space="preserve">--ce-text</w:t>
+              <w:t xml:space="preserve">--ce-ochre</w:t>
             </w:r>
           </w:p>
         </w:tc>
@@ -531,7 +531,7 @@
                 <w:b w:val="false"/>
                 <w:bCs w:val="false"/>
               </w:rPr>
-              <w:t xml:space="preserve">#f3ebdc</w:t>
+              <w:t xml:space="preserve">#cd9229</w:t>
             </w:r>
           </w:p>
         </w:tc>
@@ -552,7 +552,7 @@
                 <w:b w:val="false"/>
                 <w:bCs w:val="false"/>
               </w:rPr>
-              <w:t xml:space="preserve">Имена и основной текст</w:t>
+              <w:t xml:space="preserve">Охра из логотипа: должности, номера, инициалы</w:t>
             </w:r>
           </w:p>
         </w:tc>
@@ -575,7 +575,7 @@
                 <w:b w:val="false"/>
                 <w:bCs w:val="false"/>
               </w:rPr>
-              <w:t xml:space="preserve">--ce-muted</w:t>
+              <w:t xml:space="preserve">--ce-ochre-light</w:t>
             </w:r>
           </w:p>
         </w:tc>
@@ -596,7 +596,7 @@
                 <w:b w:val="false"/>
                 <w:bCs w:val="false"/>
               </w:rPr>
-              <w:t xml:space="preserve">#b9ad98</w:t>
+              <w:t xml:space="preserve">#e4b155</w:t>
             </w:r>
           </w:p>
         </w:tc>
@@ -617,7 +617,7 @@
                 <w:b w:val="false"/>
                 <w:bCs w:val="false"/>
               </w:rPr>
-              <w:t xml:space="preserve">Описания и подписи</w:t>
+              <w:t xml:space="preserve">Светлая охра для текста на бордовом фоне</w:t>
             </w:r>
           </w:p>
         </w:tc>
@@ -640,7 +640,7 @@
                 <w:b w:val="false"/>
                 <w:bCs w:val="false"/>
               </w:rPr>
-              <w:t xml:space="preserve">--ce-accent</w:t>
+              <w:t xml:space="preserve">--ce-text</w:t>
             </w:r>
           </w:p>
         </w:tc>
@@ -661,7 +661,7 @@
                 <w:b w:val="false"/>
                 <w:bCs w:val="false"/>
               </w:rPr>
-              <w:t xml:space="preserve">#d4a73a</w:t>
+              <w:t xml:space="preserve">#faf7f2</w:t>
             </w:r>
           </w:p>
         </w:tc>
@@ -682,7 +682,7 @@
                 <w:b w:val="false"/>
                 <w:bCs w:val="false"/>
               </w:rPr>
-              <w:t xml:space="preserve">Должности, номера, инициалы, ссылки</w:t>
+              <w:t xml:space="preserve">Имена и основной текст</w:t>
             </w:r>
           </w:p>
         </w:tc>
@@ -705,7 +705,7 @@
                 <w:b w:val="false"/>
                 <w:bCs w:val="false"/>
               </w:rPr>
-              <w:t xml:space="preserve">--ce-photo-bg</w:t>
+              <w:t xml:space="preserve">--ce-muted</w:t>
             </w:r>
           </w:p>
         </w:tc>
@@ -726,7 +726,7 @@
                 <w:b w:val="false"/>
                 <w:bCs w:val="false"/>
               </w:rPr>
-              <w:t xml:space="preserve">#2a241b</w:t>
+              <w:t xml:space="preserve">#b5aea4</w:t>
             </w:r>
           </w:p>
         </w:tc>
@@ -747,7 +747,72 @@
                 <w:b w:val="false"/>
                 <w:bCs w:val="false"/>
               </w:rPr>
-              <w:t xml:space="preserve">Фон заглушки, пока нет фото</w:t>
+              <w:t xml:space="preserve">Описания на чёрном фоне</w:t>
+            </w:r>
+          </w:p>
+        </w:tc>
+      </w:tr>
+      <w:tr>
+        <w:tc>
+          <w:tcPr>
+            <w:tcW w:type="dxa" w:w="2600"/>
+            <w:tcMar>
+              <w:top w:type="dxa" w:w="80"/>
+              <w:left w:type="dxa" w:w="120"/>
+              <w:bottom w:type="dxa" w:w="80"/>
+              <w:right w:type="dxa" w:w="120"/>
+            </w:tcMar>
+          </w:tcPr>
+          <w:p>
+            <w:r>
+              <w:rPr>
+                <w:rFonts w:ascii="Courier New" w:cs="Courier New" w:eastAsia="Courier New" w:hAnsi="Courier New"/>
+                <w:b w:val="false"/>
+                <w:bCs w:val="false"/>
+              </w:rPr>
+              <w:t xml:space="preserve">--ce-muted-alt</w:t>
+            </w:r>
+          </w:p>
+        </w:tc>
+        <w:tc>
+          <w:tcPr>
+            <w:tcW w:type="dxa" w:w="2000"/>
+            <w:tcMar>
+              <w:top w:type="dxa" w:w="80"/>
+              <w:left w:type="dxa" w:w="120"/>
+              <w:bottom w:type="dxa" w:w="80"/>
+              <w:right w:type="dxa" w:w="120"/>
+            </w:tcMar>
+          </w:tcPr>
+          <w:p>
+            <w:r>
+              <w:rPr>
+                <w:rFonts w:ascii="Courier New" w:cs="Courier New" w:eastAsia="Courier New" w:hAnsi="Courier New"/>
+                <w:b w:val="false"/>
+                <w:bCs w:val="false"/>
+              </w:rPr>
+              <w:t xml:space="preserve">#ecd9dc</w:t>
+            </w:r>
+          </w:p>
+        </w:tc>
+        <w:tc>
+          <w:tcPr>
+            <w:tcW w:type="dxa" w:w="4426"/>
+            <w:tcMar>
+              <w:top w:type="dxa" w:w="80"/>
+              <w:left w:type="dxa" w:w="120"/>
+              <w:bottom w:type="dxa" w:w="80"/>
+              <w:right w:type="dxa" w:w="120"/>
+            </w:tcMar>
+          </w:tcPr>
+          <w:p>
+            <w:r>
+              <w:rPr>
+                <w:rFonts w:ascii="Arial" w:cs="Arial" w:eastAsia="Arial" w:hAnsi="Arial"/>
+                <w:b w:val="false"/>
+                <w:bCs w:val="false"/>
+              </w:rPr>
+              <w:t xml:space="preserve">Описания на бордовом фоне</w:t>
             </w:r>
           </w:p>
         </w:tc>
@@ -766,7 +831,7 @@
         <w:spacing w:after="120"/>
       </w:pPr>
       <w:r>
-        <w:t xml:space="preserve">Где взять коды цветов: в Tilda откройте страницу анонса, нажмите на нужный блок → «Настройки» → поле цвета фона или текста — там указан код вида #1A1A1A.</w:t>
+        <w:t xml:space="preserve">Светлая охра используется только на бордовом фоне: фирменная охра на бордо читается хуже, поэтому для мелкого текста там взят оттенок чуть светлее.</w:t>
       </w:r>
     </w:p>
     <w:p>

</xml_diff>

<commit_message>
Restyle Team page to match the 2027 announcement page
Light layout with ochre hero, bordeaux accents, card borders and Tahoma,
taken from the announcement page screenshots.

Co-Authored-By: Claude Opus 5.5 <noreply@anthropic.com>
Claude-Session: https://claude.ai/code/session_01KNCHjSiF6uUnNEUPxpBrDj
</commit_message>
<xml_diff>
--- a/tilda/TEAM_PAGE_GUIDE.docx
+++ b/tilda/TEAM_PAGE_GUIDE.docx
@@ -271,7 +271,7 @@
         <w:spacing w:after="120"/>
       </w:pPr>
       <w:r>
-        <w:t xml:space="preserve">Страница окрашена в цвета логотипа Cheese Expo: чёрный, бордо и охра. Коды сняты с файла логотипа. Все цвета собраны в начале кода, в разделе «ЦВЕТА БРЕНДА — меняйте только здесь» — если понадобится поправить оттенок, достаточно заменить код после двоеточия, остальная страница перекрасится сама.</w:t>
+        <w:t xml:space="preserve">Страница окрашена в цвета страницы анонса Cheese Expo 2027: охра, бордо, серый и белый, шрифт Tahoma. Коды сняты со скриншотов анонса. Все цвета собраны в начале кода, в разделе «ЦВЕТА БРЕНДА — меняйте только здесь»: чтобы поправить оттенок, замените код после двоеточия, остальная страница перекрасится сама.</w:t>
       </w:r>
     </w:p>
     <w:tbl>
@@ -380,7 +380,7 @@
                 <w:b w:val="false"/>
                 <w:bCs w:val="false"/>
               </w:rPr>
-              <w:t xml:space="preserve">--ce-black</w:t>
+              <w:t xml:space="preserve">--ce-ochre</w:t>
             </w:r>
           </w:p>
         </w:tc>
@@ -401,7 +401,7 @@
                 <w:b w:val="false"/>
                 <w:bCs w:val="false"/>
               </w:rPr>
-              <w:t xml:space="preserve">#0b0b0b</w:t>
+              <w:t xml:space="preserve">#cd9236</w:t>
             </w:r>
           </w:p>
         </w:tc>
@@ -422,7 +422,7 @@
                 <w:b w:val="false"/>
                 <w:bCs w:val="false"/>
               </w:rPr>
-              <w:t xml:space="preserve">Чёрный из логотипа: основной фон</w:t>
+              <w:t xml:space="preserve">Охра: первый экран, полосы карточек 2 и 4</w:t>
             </w:r>
           </w:p>
         </w:tc>
@@ -445,7 +445,7 @@
                 <w:b w:val="false"/>
                 <w:bCs w:val="false"/>
               </w:rPr>
-              <w:t xml:space="preserve">--ce-bordeaux</w:t>
+              <w:t xml:space="preserve">--ce-ochre-light</w:t>
             </w:r>
           </w:p>
         </w:tc>
@@ -466,7 +466,7 @@
                 <w:b w:val="false"/>
                 <w:bCs w:val="false"/>
               </w:rPr>
-              <w:t xml:space="preserve">#7d0e25</w:t>
+              <w:t xml:space="preserve">#ddb260</w:t>
             </w:r>
           </w:p>
         </w:tc>
@@ -487,7 +487,7 @@
                 <w:b w:val="false"/>
                 <w:bCs w:val="false"/>
               </w:rPr>
-              <w:t xml:space="preserve">Бордо из логотипа: фон 2-й и 4-й секции, заглушки фото</w:t>
+              <w:t xml:space="preserve">Светлая охра: плашка должности, заглушка фото</w:t>
             </w:r>
           </w:p>
         </w:tc>
@@ -510,7 +510,7 @@
                 <w:b w:val="false"/>
                 <w:bCs w:val="false"/>
               </w:rPr>
-              <w:t xml:space="preserve">--ce-ochre</w:t>
+              <w:t xml:space="preserve">--ce-bordeaux</w:t>
             </w:r>
           </w:p>
         </w:tc>
@@ -531,7 +531,7 @@
                 <w:b w:val="false"/>
                 <w:bCs w:val="false"/>
               </w:rPr>
-              <w:t xml:space="preserve">#cd9229</w:t>
+              <w:t xml:space="preserve">#7d1a25</w:t>
             </w:r>
           </w:p>
         </w:tc>
@@ -552,7 +552,7 @@
                 <w:b w:val="false"/>
                 <w:bCs w:val="false"/>
               </w:rPr>
-              <w:t xml:space="preserve">Охра из логотипа: должности, номера, инициалы</w:t>
+              <w:t xml:space="preserve">Бордо: «Команда», имена, номера, линии, полосы</w:t>
             </w:r>
           </w:p>
         </w:tc>
@@ -575,7 +575,7 @@
                 <w:b w:val="false"/>
                 <w:bCs w:val="false"/>
               </w:rPr>
-              <w:t xml:space="preserve">--ce-ochre-light</w:t>
+              <w:t xml:space="preserve">--ce-grey</w:t>
             </w:r>
           </w:p>
         </w:tc>
@@ -596,7 +596,7 @@
                 <w:b w:val="false"/>
                 <w:bCs w:val="false"/>
               </w:rPr>
-              <w:t xml:space="preserve">#e4b155</w:t>
+              <w:t xml:space="preserve">#808080</w:t>
             </w:r>
           </w:p>
         </w:tc>
@@ -617,7 +617,7 @@
                 <w:b w:val="false"/>
                 <w:bCs w:val="false"/>
               </w:rPr>
-              <w:t xml:space="preserve">Светлая охра для текста на бордовом фоне</w:t>
+              <w:t xml:space="preserve">Серый: заглушка фото у 2-го и 4-го</w:t>
             </w:r>
           </w:p>
         </w:tc>
@@ -640,7 +640,7 @@
                 <w:b w:val="false"/>
                 <w:bCs w:val="false"/>
               </w:rPr>
-              <w:t xml:space="preserve">--ce-text</w:t>
+              <w:t xml:space="preserve">--ce-grey-light</w:t>
             </w:r>
           </w:p>
         </w:tc>
@@ -661,7 +661,7 @@
                 <w:b w:val="false"/>
                 <w:bCs w:val="false"/>
               </w:rPr>
-              <w:t xml:space="preserve">#faf7f2</w:t>
+              <w:t xml:space="preserve">#f6f6f6</w:t>
             </w:r>
           </w:p>
         </w:tc>
@@ -682,7 +682,7 @@
                 <w:b w:val="false"/>
                 <w:bCs w:val="false"/>
               </w:rPr>
-              <w:t xml:space="preserve">Имена и основной текст</w:t>
+              <w:t xml:space="preserve">Светло-серый: фон 2-й и 4-й секции</w:t>
             </w:r>
           </w:p>
         </w:tc>
@@ -705,7 +705,7 @@
                 <w:b w:val="false"/>
                 <w:bCs w:val="false"/>
               </w:rPr>
-              <w:t xml:space="preserve">--ce-muted</w:t>
+              <w:t xml:space="preserve">--ce-white</w:t>
             </w:r>
           </w:p>
         </w:tc>
@@ -726,7 +726,7 @@
                 <w:b w:val="false"/>
                 <w:bCs w:val="false"/>
               </w:rPr>
-              <w:t xml:space="preserve">#b5aea4</w:t>
+              <w:t xml:space="preserve">#ffffff</w:t>
             </w:r>
           </w:p>
         </w:tc>
@@ -747,7 +747,7 @@
                 <w:b w:val="false"/>
                 <w:bCs w:val="false"/>
               </w:rPr>
-              <w:t xml:space="preserve">Описания на чёрном фоне</w:t>
+              <w:t xml:space="preserve">Белый: фон страницы и карточек</w:t>
             </w:r>
           </w:p>
         </w:tc>
@@ -770,7 +770,7 @@
                 <w:b w:val="false"/>
                 <w:bCs w:val="false"/>
               </w:rPr>
-              <w:t xml:space="preserve">--ce-muted-alt</w:t>
+              <w:t xml:space="preserve">--ce-text</w:t>
             </w:r>
           </w:p>
         </w:tc>
@@ -791,7 +791,7 @@
                 <w:b w:val="false"/>
                 <w:bCs w:val="false"/>
               </w:rPr>
-              <w:t xml:space="preserve">#ecd9dc</w:t>
+              <w:t xml:space="preserve">#0c0c0c</w:t>
             </w:r>
           </w:p>
         </w:tc>
@@ -812,7 +812,72 @@
                 <w:b w:val="false"/>
                 <w:bCs w:val="false"/>
               </w:rPr>
-              <w:t xml:space="preserve">Описания на бордовом фоне</w:t>
+              <w:t xml:space="preserve">Основной текст</w:t>
+            </w:r>
+          </w:p>
+        </w:tc>
+      </w:tr>
+      <w:tr>
+        <w:tc>
+          <w:tcPr>
+            <w:tcW w:type="dxa" w:w="2600"/>
+            <w:tcMar>
+              <w:top w:type="dxa" w:w="80"/>
+              <w:left w:type="dxa" w:w="120"/>
+              <w:bottom w:type="dxa" w:w="80"/>
+              <w:right w:type="dxa" w:w="120"/>
+            </w:tcMar>
+          </w:tcPr>
+          <w:p>
+            <w:r>
+              <w:rPr>
+                <w:rFonts w:ascii="Courier New" w:cs="Courier New" w:eastAsia="Courier New" w:hAnsi="Courier New"/>
+                <w:b w:val="false"/>
+                <w:bCs w:val="false"/>
+              </w:rPr>
+              <w:t xml:space="preserve">--ce-text-soft</w:t>
+            </w:r>
+          </w:p>
+        </w:tc>
+        <w:tc>
+          <w:tcPr>
+            <w:tcW w:type="dxa" w:w="2000"/>
+            <w:tcMar>
+              <w:top w:type="dxa" w:w="80"/>
+              <w:left w:type="dxa" w:w="120"/>
+              <w:bottom w:type="dxa" w:w="80"/>
+              <w:right w:type="dxa" w:w="120"/>
+            </w:tcMar>
+          </w:tcPr>
+          <w:p>
+            <w:r>
+              <w:rPr>
+                <w:rFonts w:ascii="Courier New" w:cs="Courier New" w:eastAsia="Courier New" w:hAnsi="Courier New"/>
+                <w:b w:val="false"/>
+                <w:bCs w:val="false"/>
+              </w:rPr>
+              <w:t xml:space="preserve">#3a3a3a</w:t>
+            </w:r>
+          </w:p>
+        </w:tc>
+        <w:tc>
+          <w:tcPr>
+            <w:tcW w:type="dxa" w:w="4426"/>
+            <w:tcMar>
+              <w:top w:type="dxa" w:w="80"/>
+              <w:left w:type="dxa" w:w="120"/>
+              <w:bottom w:type="dxa" w:w="80"/>
+              <w:right w:type="dxa" w:w="120"/>
+            </w:tcMar>
+          </w:tcPr>
+          <w:p>
+            <w:r>
+              <w:rPr>
+                <w:rFonts w:ascii="Arial" w:cs="Arial" w:eastAsia="Arial" w:hAnsi="Arial"/>
+                <w:b w:val="false"/>
+                <w:bCs w:val="false"/>
+              </w:rPr>
+              <w:t xml:space="preserve">Описания</w:t>
             </w:r>
           </w:p>
         </w:tc>
@@ -828,14 +893,6 @@
     </w:p>
     <w:p>
       <w:pPr>
-        <w:spacing w:after="120"/>
-      </w:pPr>
-      <w:r>
-        <w:t xml:space="preserve">Светлая охра используется только на бордовом фоне: фирменная охра на бордо читается хуже, поэтому для мелкого текста там взят оттенок чуть светлее.</w:t>
-      </w:r>
-    </w:p>
-    <w:p>
-      <w:pPr>
         <w:pStyle w:val="Heading1"/>
         <w:spacing w:after="160" w:before="360"/>
       </w:pPr>
@@ -914,7 +971,7 @@
         <w:spacing w:after="60"/>
       </w:pPr>
       <w:r>
-        <w:t xml:space="preserve">Каждый участник — отдельный экран: фото на половину ширины, справа или слева по очереди.</w:t>
+        <w:t xml:space="preserve">Каждый участник — отдельный экран: карточка в стиле анонса с бордовой или охристой полосой, фото на половину ширины, справа или слева по очереди.</w:t>
       </w:r>
     </w:p>
     <w:p>
@@ -953,7 +1010,7 @@
         <w:spacing w:after="60"/>
       </w:pPr>
       <w:r>
-        <w:t xml:space="preserve">Шрифты Cormorant Garamond (имена) и Manrope (текст) с поддержкой кириллицы подключаются автоматически.</w:t>
+        <w:t xml:space="preserve">Шрифт Tahoma, как на странице анонса; если его нет на устройстве, используется Verdana или Arial.</w:t>
       </w:r>
     </w:p>
     <w:p>

</xml_diff>